<commit_message>
Update HTSA paper DOCX artifacts
</commit_message>
<xml_diff>
--- a/HTSA_Paper.docx
+++ b/HTSA_Paper.docx
@@ -1213,16 +1213,15 @@
             <w:shd w:fill="F5F6F7"/>
           </w:tcPr>
           <w:p>
-            <w:pPr>
-              <w:spacing w:line="240" w:lineRule="auto"/>
-            </w:pPr>
             <w:r/>
             <w:r>
               <w:rPr>
                 <w:rFonts w:ascii="Courier New" w:hAnsi="Courier New"/>
-                <w:sz w:val="16"/>
+                <w:sz w:val="18"/>
               </w:rPr>
-              <w:t>prefetch SRR35329980 &amp;&amp;\\ fasterq-dump SRR35329980 --split-files -O fastq/</w:t>
+              <w:t>prefetch SRR35329980 &amp;&amp;</w:t>
+              <w:br/>
+              <w:t>fasterq-dump SRR35329980 --split-files -O fastq/</w:t>
             </w:r>
           </w:p>
         </w:tc>
@@ -1276,14 +1275,11 @@
             <w:shd w:fill="F5F6F7"/>
           </w:tcPr>
           <w:p>
-            <w:pPr>
-              <w:spacing w:line="240" w:lineRule="auto"/>
-            </w:pPr>
             <w:r/>
             <w:r>
               <w:rPr>
                 <w:rFonts w:ascii="Courier New" w:hAnsi="Courier New"/>
-                <w:sz w:val="16"/>
+                <w:sz w:val="18"/>
               </w:rPr>
               <w:t>fastqc raw/*.fastq.gz trimmed/*.fastq.gz --outdir fastqc_reports/</w:t>
             </w:r>
@@ -1339,14 +1335,11 @@
             <w:shd w:fill="F5F6F7"/>
           </w:tcPr>
           <w:p>
-            <w:pPr>
-              <w:spacing w:line="240" w:lineRule="auto"/>
-            </w:pPr>
             <w:r/>
             <w:r>
               <w:rPr>
                 <w:rFonts w:ascii="Courier New" w:hAnsi="Courier New"/>
-                <w:sz w:val="16"/>
+                <w:sz w:val="18"/>
               </w:rPr>
               <w:t>multiqc fastqc_reports/ fastp_reports_full/ -o multiqc/</w:t>
             </w:r>
@@ -1402,16 +1395,21 @@
             <w:shd w:fill="F5F6F7"/>
           </w:tcPr>
           <w:p>
-            <w:pPr>
-              <w:spacing w:line="240" w:lineRule="auto"/>
-            </w:pPr>
             <w:r/>
             <w:r>
               <w:rPr>
                 <w:rFonts w:ascii="Courier New" w:hAnsi="Courier New"/>
-                <w:sz w:val="16"/>
+                <w:sz w:val="18"/>
               </w:rPr>
-              <w:t>fastp -i sample_R1.fastq.gz -I sample_R2.fastq.gz\\ -o clean_R1.fastq.gz -O clean_R2.fastq.gz\\ --detect_adapter_for_pe --trim_poly_g\\ --cut_mean_quality 20 --length_required 30\\ -h sample.html -j sample.json</w:t>
+              <w:t>fastp -i sample_R1.fastq.gz -I sample_R2.fastq.gz</w:t>
+              <w:br/>
+              <w:t>-o clean_R1.fastq.gz -O clean_R2.fastq.gz</w:t>
+              <w:br/>
+              <w:t>--detect_adapter_for_pe --trim_poly_g</w:t>
+              <w:br/>
+              <w:t>--cut_mean_quality 20 --length_required 30</w:t>
+              <w:br/>
+              <w:t>-h sample.html -j sample.json</w:t>
             </w:r>
           </w:p>
         </w:tc>
@@ -1465,16 +1463,23 @@
             <w:shd w:fill="F5F6F7"/>
           </w:tcPr>
           <w:p>
-            <w:pPr>
-              <w:spacing w:line="240" w:lineRule="auto"/>
-            </w:pPr>
             <w:r/>
             <w:r>
               <w:rPr>
                 <w:rFonts w:ascii="Courier New" w:hAnsi="Courier New"/>
-                <w:sz w:val="16"/>
+                <w:sz w:val="18"/>
               </w:rPr>
-              <w:t>STAR --runThreadN 8 --genomeDir star_index\\ --readFilesIn clean_R1.fastq.gz clean_R2.fastq.gz\\ --readFilesCommand zcat\\ --sjdbGTFfile Mus_musculus.GRCm39.115.gtf\\ --outSAMtype BAM SortedByCoordinate\\ --quantMode GeneCounts</w:t>
+              <w:t>STAR --runThreadN 8 --genomeDir star_index</w:t>
+              <w:br/>
+              <w:t>--readFilesIn clean_R1.fastq.gz clean_R2.fastq.gz</w:t>
+              <w:br/>
+              <w:t>--readFilesCommand zcat</w:t>
+              <w:br/>
+              <w:t>--sjdbGTFfile Mus_musculus.GRCm39.115.gtf</w:t>
+              <w:br/>
+              <w:t>--outSAMtype BAM SortedByCoordinate</w:t>
+              <w:br/>
+              <w:t>--quantMode GeneCounts</w:t>
             </w:r>
           </w:p>
         </w:tc>
@@ -1528,16 +1533,17 @@
             <w:shd w:fill="F5F6F7"/>
           </w:tcPr>
           <w:p>
-            <w:pPr>
-              <w:spacing w:line="240" w:lineRule="auto"/>
-            </w:pPr>
             <w:r/>
             <w:r>
               <w:rPr>
                 <w:rFonts w:ascii="Courier New" w:hAnsi="Courier New"/>
-                <w:sz w:val="16"/>
+                <w:sz w:val="18"/>
               </w:rPr>
-              <w:t>dds &lt;- DESeqDataSetFromMatrix(countData, colData,\\ design = side_class * geno_class);\\ dds &lt;- DESeq(dds)</w:t>
+              <w:t>dds &lt;- DESeqDataSetFromMatrix(countData, colData,</w:t>
+              <w:br/>
+              <w:t>design = side_class * geno_class);</w:t>
+              <w:br/>
+              <w:t>dds &lt;- DESeq(dds)</w:t>
             </w:r>
           </w:p>
         </w:tc>
@@ -1591,16 +1597,17 @@
             <w:shd w:fill="F5F6F7"/>
           </w:tcPr>
           <w:p>
-            <w:pPr>
-              <w:spacing w:line="240" w:lineRule="auto"/>
-            </w:pPr>
             <w:r/>
             <w:r>
               <w:rPr>
                 <w:rFonts w:ascii="Courier New" w:hAnsi="Courier New"/>
-                <w:sz w:val="16"/>
+                <w:sz w:val="18"/>
               </w:rPr>
-              <w:t>python3 run_bendpoint_followup.py\\ --contrast ipsi_vs_contra_in_ff\\ --padj-column padj</w:t>
+              <w:t>python3 run_bendpoint_followup.py</w:t>
+              <w:br/>
+              <w:t>--contrast ipsi_vs_contra_in_ff</w:t>
+              <w:br/>
+              <w:t>--padj-column padj</w:t>
             </w:r>
           </w:p>
         </w:tc>
@@ -1654,16 +1661,17 @@
             <w:shd w:fill="F5F6F7"/>
           </w:tcPr>
           <w:p>
-            <w:pPr>
-              <w:spacing w:line="240" w:lineRule="auto"/>
-            </w:pPr>
             <w:r/>
             <w:r>
               <w:rPr>
                 <w:rFonts w:ascii="Courier New" w:hAnsi="Courier New"/>
-                <w:sz w:val="16"/>
+                <w:sz w:val="18"/>
               </w:rPr>
-              <w:t>gp.profile(organism = "mmusculus",\\ query = selected_genes,\\ sources = c("GO:BP","KEGG","REAC"))</w:t>
+              <w:t>gp.profile(organism = "mmusculus",</w:t>
+              <w:br/>
+              <w:t>query = selected_genes,</w:t>
+              <w:br/>
+              <w:t>sources = c("GO:BP", "KEGG", "REAC"))</w:t>
             </w:r>
           </w:p>
         </w:tc>
@@ -1676,12 +1684,7 @@
         <w:shd w:fill="F4CCCC"/>
       </w:pPr>
       <w:r>
-        <w:rPr>
-          <w:rFonts w:ascii="Times New Roman" w:hAnsi="Times New Roman"/>
-          <w:b w:val="0"/>
-          <w:sz w:val="24"/>
-        </w:rPr>
-        <w:t>Workflow reproducibility and version tracking. To keep the paper reproducible at a grad-level standard, the main software tools and reference resources used in the local mouse RNA-seq workflow were tracked alongside the command-level examples. The draft explicitly records fastp v0.23.2 and the GRCm39 / Ensembl release 115 reference pair, and the remaining tools below summarize the same implementation path used across download, QC, alignment, differential expression, and enrichment interpretation (NCBI, 2026; Andrews, 2010; Ewels et al., 2016; Chen et al., 2018; Dobin et al., 2013; Ensembl, 2025; Love et al., 2014; Kolberg et al., 2020).</w:t>
+        <w:t>Workflow reproducibility and version tracking. To keep the paper reproducible at a grad-level standard, the main software tools and reference resources used in the local mouse RNA-seq workflow were tracked alongside the command-level examples. The draft explicitly records fastp v0.23.2 and the GRCm39 / Ensembl release 115 reference pair, and the remaining tools below summarize the same implementation path used across download, QC, alignment, differential expression, and enrichment interpretation (NCBI SRA, 2026; Andrews, 2010; Ewels et al., 2016; Chen et al., 2018; Dobin et al., 2013; Ensembl, 2025; Love et al., 2014; Kolberg et al., 2020).</w:t>
       </w:r>
     </w:p>
     <w:p>
@@ -1839,16 +1842,9 @@
             <w:shd w:fill="F5F6F7"/>
           </w:tcPr>
           <w:p>
-            <w:pPr>
-              <w:spacing w:line="240" w:lineRule="auto"/>
-            </w:pPr>
             <w:r/>
             <w:r>
-              <w:rPr>
-                <w:rFonts w:ascii="Courier New" w:hAnsi="Courier New"/>
-                <w:sz w:val="16"/>
-              </w:rPr>
-              <w:t>SRA Toolkit workflow used for SRP618841 download and FASTQ generation</w:t>
+              <w:t>SRA Toolkit workflow used for SRP618841 download</w:t>
             </w:r>
           </w:p>
         </w:tc>
@@ -3051,19 +3047,7 @@
         <w:jc w:val="center"/>
       </w:pPr>
       <w:r>
-        <w:rPr>
-          <w:rFonts w:ascii="Times New Roman" w:hAnsi="Times New Roman"/>
-          <w:b/>
-          <w:sz w:val="20"/>
-        </w:rPr>
-        <w:t xml:space="preserve">Figure 7. </w:t>
-      </w:r>
-      <w:r>
-        <w:rPr>
-          <w:rFonts w:ascii="Times New Roman" w:hAnsi="Times New Roman"/>
-          <w:sz w:val="20"/>
-        </w:rPr>
-        <w:t>Ordered adjusted-p</w:t>
+        <w:t>Figure 7. Ordered adjusted-p-value and cumulative significance curves used to illustrate bend-point narrowing. The bend point marks the transition from the steepest high-confidence portion of the ranked list to the flatter tail, providing a contrast-specific follow-up threshold rather than an arbitrary fixed gene count.</w:t>
       </w:r>
     </w:p>
     <w:p>
@@ -3072,12 +3056,7 @@
         <w:shd w:fill="D9D2E9"/>
       </w:pPr>
       <w:r>
-        <w:rPr>
-          <w:rFonts w:ascii="Times New Roman" w:hAnsi="Times New Roman"/>
-          <w:b w:val="0"/>
-          <w:sz w:val="24"/>
-        </w:rPr>
-        <w:t>Because the side-specific contrasts produced very large sets of significant genes, a bend-point rule was used to reduce those outputs to more interpretable follow-up sets. In the ipsi_vs_contra_in_ff branch, the bend point occurred at an adjusted-p-value threshold of 1.37 10^-17, reducing the broader significant set to 709 genes. This narrowed subset still captured strongly supported differential expression while removing much of the dense background that made the full result harder to interpret biologically.</w:t>
+        <w:t>Because the side-specific contrasts produced very large sets of significant genes, a bend-point rule was used to reduce those outputs to more interpretable follow-up sets. In the ipsi_vs_contra_in_ff branch, the bend point occurred at an adjusted-p-value threshold of 1.37 × 10^-17, reducing the broader significant set to 709 genes. This narrowed subset still captured strongly supported differential expression while removing much of the dense background that made the full result harder to interpret biologically.</w:t>
       </w:r>
     </w:p>
     <w:p>
@@ -3086,12 +3065,7 @@
         <w:shd w:fill="F4CCCC"/>
       </w:pPr>
       <w:r>
-        <w:rPr>
-          <w:rFonts w:ascii="Times New Roman" w:hAnsi="Times New Roman"/>
-          <w:b w:val="0"/>
-          <w:sz w:val="24"/>
-        </w:rPr>
-        <w:t>The same narrowing rule was then applied to the ipsi_vs_contra_in_cre branch, which began with 7,541 significant genes and converged to an 870-gene follow-up set at a branch-specific bend point of 8.40 10^-17. This second branch did not come from a different dataset or a separate ad hoc analysis; it came from the same fitted DESeq2 model and the same ordered adjusted-p-value procedure used for the WT branch. That parallel treatment is important because it shows that the side-specific injury signal remains strong in cKO as well, while also leaving room to compare how genotype background expands or shifts the follow-up set (Love et al., 2014).</w:t>
+        <w:t>The same narrowing rule was then applied to the ipsi_vs_contra_in_cre branch, which began with 7,541 significant genes and converged to an 870-gene follow-up set at a branch-specific bend point of 8.40 × 10^-17. This second branch did not come from a different dataset or a separate ad hoc analysis; it came from the same fitted DESeq2 model and the same ordered adjusted-p-value procedure used for the WT branch. That parallel treatment is important because it shows that the side-specific injury signal remains strong in cKO as well, while also leaving room to compare how genotype background expands or shifts the follow-up set (Love et al., 2014).</w:t>
       </w:r>
     </w:p>
     <w:p>

</xml_diff>